<commit_message>
Add reference PDFs for BOTS opening section; remove Dimova
Force-add local PDFs (gitignored by default): Wu & Hong 2022, Koinig 2022,
Koteyko & Atanasova 2018, Chang 2009, Martin 2004, Naslund et al. 2016.
Update references/README.md (drop Dimova, correct Naslund year to 2016).
Proposal v07 already has Dimova citations replaced with Koteyko & Atanasova.
</commit_message>
<xml_diff>
--- a/thesis/Thesis_Proposal_Instagram_MH_v07.docx
+++ b/thesis/Thesis_Proposal_Instagram_MH_v07.docx
@@ -450,7 +450,7 @@
           <w:szCs w:val="22"/>
           <w:rtl w:val="0"/>
         </w:rPr>
-        <w:t xml:space="preserve">Instagram has emerged as a significant platform for public mental health communication, with dedicated advocacy pages producing high-volume, high-engagement content that consistently employs positive linguistic framing (Wu &amp; Hong, 2022; Koinig, 2022). Research confirms that mental health-related posts on Instagram are predominantly oriented toward encouragement, recovery, and community support, and that such content attracts substantial audience interaction (Naslund et al., 2020; Dimova, 2024). These captions operate as concise discursive units in which lexical choices, modality, and directive structures converge to produce specific social meanings in a digitally mediated public space. Despite this documented prevalence, the specific lexical and grammatical mechanisms through which such short-form texts construct hope and empowerment remain underexamined within the applied linguistics and discourse analysis literature.</w:t>
+        <w:t>Instagram has emerged as a significant platform for public mental health communication, with dedicated advocacy pages producing high-volume, high-engagement content that consistently employs positive linguistic framing (Wu &amp; Hong, 2022; Koinig, 2022). Research confirms that mental health-related posts on Instagram are predominantly oriented toward encouragement, recovery, and community support, and that such content attracts substantial audience interaction (Naslund et al., 2020; Wu &amp; Hong, 2022). These captions operate as concise discursive units in which lexical choices, modality, and directive structures converge to produce specific social meanings in a digitally mediated public space. Despite this documented prevalence, the specific lexical and grammatical mechanisms through which such short-form texts construct hope and empowerment remain underexamined within the applied linguistics and discourse analysis literature.</w:t>
       </w:r>
       <w:r>
         <w:rPr>
@@ -696,7 +696,7 @@
           <w:szCs w:val="22"/>
           <w:rtl w:val="0"/>
         </w:rPr>
-        <w:t xml:space="preserve">Koinig (2022) surveyed 532 active Instagram users and reported that motivational quotes received higher engagement than other content formats. Dimova (2024), employing appraisal theory within SFL, analyzed 272 posts from three UK mental health organizations across Instagram, Facebook, and Twitter, finding that organizations construct positive evaluations of affected individuals through distinct visual and linguistic strategies. These studies establish that Instagram mental health pages intentionally use positive framing, but they stop short of categorizing the specific lexical and grammatical strategies through a PDA lens, or mapping how comment language structurally aligns with caption strategies.</w:t>
+        <w:t>Koinig (2022) surveyed 532 active Instagram users and reported that motivational quotes received higher engagement than other content formats. Koteyko and Atanasova (2018), examining mental health advocacy tweets during Depression Awareness Week, showed how users and organisations deploy positioning strategies and multimodal resources to invite empathy, validate experience, and construct collective support. These studies establish that Instagram and related platforms intentionally use positive framing, but they stop short of categorizing the specific lexical and grammatical strategies through a PDA lens, or mapping how comment language structurally aligns with caption strategies.</w:t>
       </w:r>
       <w:r>
         <w:rPr>
@@ -821,7 +821,7 @@
           <w:szCs w:val="22"/>
           <w:rtl w:val="0"/>
         </w:rPr>
-        <w:t xml:space="preserve">Despite the growing volume of mental health content on Instagram, few studies apply a discourse-analytic lens to categorize the specific lexical and grammatical strategies used in captions, and fewer still examine how comment language structurally aligns with those strategies. While Dimova (2024) demonstrates the value of SFL approaches for analyzing mental health advocacy discourse, her focus on multimodal valence across multiple platforms differs from this study's specific focus on hope and empowerment construction within Instagram captions.</w:t>
+        <w:t>Despite the growing volume of mental health content on Instagram, few studies apply a discourse-analytic lens to categorize the specific lexical and grammatical strategies used in captions, and fewer still examine how comment language structurally aligns with those strategies. While Koteyko and Atanasova (2018) demonstrate the value of discourse-analytic approaches for analyzing mental health advocacy on social media, their focus on Twitter positioning and multimodal interaction differs from this study's specific focus on hope and empowerment construction within Instagram captions.</w:t>
       </w:r>
       <w:r>
         <w:rPr>
@@ -1323,16 +1323,15 @@
           <w:szCs w:val="22"/>
           <w:rtl w:val="0"/>
         </w:rPr>
-        <w:t xml:space="preserve">Health Communication Researchers. </w:t>
-      </w:r>
-      <w:r>
-        <w:rPr>
-          <w:rFonts w:ascii="Georgia" w:cs="Georgia" w:eastAsia="Georgia" w:hAnsi="Georgia"/>
-          <w:sz w:val="22"/>
-          <w:szCs w:val="22"/>
-          <w:rtl w:val="0"/>
-        </w:rPr>
-        <w:t xml:space="preserve">The study provides a linguistically grounded description of how short-form digital texts construct positive mental health discourse at the lexical and grammatical level, complementing Dimova's (2024) multimodal valence analysis with a focused, function-driven PDA coding of hope and empowerment strategies.</w:t>
+        <w:t>Health Communication Researchers. The study provides a linguistically grounded description of how short-form digital texts construct positive mental health discourse at the lexical and grammatical level, complementing existing discourse analyses of mental health advocacy on social media (e.g., Koteyko &amp; Atanasova, 2018) with a focused, function-driven PDA coding of hope and empowerment strategies.</w:t>
+      </w:r>
+      <w:r>
+        <w:rPr>
+          <w:rFonts w:ascii="Georgia" w:cs="Georgia" w:eastAsia="Georgia" w:hAnsi="Georgia"/>
+          <w:sz w:val="22"/>
+          <w:szCs w:val="22"/>
+          <w:rtl w:val="0"/>
+        </w:rPr>
       </w:r>
       <w:r>
         <w:rPr>
@@ -2284,7 +2283,7 @@
           <w:szCs w:val="22"/>
           <w:rtl w:val="0"/>
         </w:rPr>
-        <w:t xml:space="preserve">This study employs a qualitative discourse analysis design guided by Positive Discourse Analysis (Martin, 2004). Qualitative design is appropriate because the goal is to interpret linguistic patterns, identify discursive strategies, and describe how meaning is constructed in naturalistic digital texts. A corpus of 30 captions provides sufficient depth for pattern identification and proportional description while remaining feasible for a solo undergraduate researcher. In discourse analysis, corpus size is determined by the depth of analysis rather than statistical representativeness; studies applying SFL-based coding to comparable short-form digital corpora have worked within similar ranges (Dimova, 2024; Macgilchrist, 2007). The design prioritizes analytical rigor, transparent coding protocols, and clearly bounded scope over volume or statistical generalization.</w:t>
+        <w:t>This study employs a qualitative discourse analysis design guided by Positive Discourse Analysis (Martin, 2004). Qualitative design is appropriate because the goal is to interpret linguistic patterns, identify discursive strategies, and describe how meaning is constructed in naturalistic digital texts. A corpus of 30 captions provides sufficient depth for pattern identification and proportional description while remaining feasible for a solo undergraduate researcher. In discourse analysis, corpus size is determined by the depth of analysis rather than statistical representativeness; studies applying SFL-based coding to comparable short-form digital corpora have worked within similar ranges (Macgilchrist, 2007; Koteyko &amp; Atanasova, 2018). The design prioritizes analytical rigor, transparent coding protocols, and clearly bounded scope over volume or statistical generalization.</w:t>
       </w:r>
       <w:r>
         <w:rPr>
@@ -2607,7 +2606,7 @@
           <w:szCs w:val="22"/>
           <w:rtl w:val="0"/>
         </w:rPr>
-        <w:t xml:space="preserve">The corpus consists of a maximum of 30 Instagram captions in total — not 30 per year — sourced from publicly accessible, English-language mental health advocacy pages published between 2023 and 2025. Posts from across this three-year window are pooled into a single dataset; no cross-year comparison is performed. Corpus construction follows a stratified purposive sampling strategy (Patton, 2002). Stratification is applied by account, with each qualifying page contributing approximately three to five posts to prevent any single account from dominating the corpus and to ensure representativeness across different advocacy page styles and audiences. Within each stratum, posts are purposively selected based on the following criteria: (1) published between 2023 and 2025; (2) caption contains a minimum of 30 English words, ensuring sufficient lexical material for PDA coding; (3) content clearly addresses mental health awareness, support, coping, or advocacy; (4) caption is fully visible without platform truncation; and (5) the post demonstrates observable public engagement, defined as at least 100 likes and 20 visible comments. Stratified purposive sampling is appropriate because it combines the intentional, criteria-based logic of purposive sampling — selecting texts that are analytically relevant rather than statistically random — with a stratification structure that controls for account-level influence, ensuring the corpus reflects a range of advocacy voices rather than a single page’s discourse patterns (Patton, 2002; Dimova, 2024). The top two algorithmically surfaced visible comments per post are extracted for linguistic coding. Total visible comment count is logged per post. All data is anonymized, stored securely, and used strictly for qualitative discourse analysis.</w:t>
+        <w:t>The corpus consists of a maximum of 30 Instagram captions in total — not 30 per year — sourced from publicly accessible, English-language mental health advocacy pages published between 2023 and 2025. Posts from across this three-year window are pooled into a single dataset; no cross-year comparison is performed. Corpus construction follows a stratified purposive sampling strategy (Patton, 2002). Stratification is applied by account, with each qualifying page contributing approximately three to five posts to prevent any single account from dominating the corpus and to ensure representativeness across different advocacy page styles and audiences. Within each stratum, posts are purposively selected based on the following criteria: (1) published between 2023 and 2025; (2) caption contains a minimum of 30 English words, ensuring sufficient lexical material for PDA coding; (3) content clearly addresses mental health awareness, support, coping, or advocacy; (4) caption is fully visible without platform truncation; and (5) the post demonstrates observable public engagement, defined as at least 100 likes and 20 visible comments. Stratified purposive sampling is appropriate because it combines the intentional, criteria-based logic of purposive sampling — selecting texts that are analytically relevant rather than statistically random — with a stratification structure that controls for account-level influence, ensuring the corpus reflects a range of advocacy voices rather than a single page’s discourse patterns (Patton, 2002). The top two algorithmically surfaced visible comments per post are extracted for linguistic coding. Total visible comment count is logged per post. All data is anonymized, stored securely, and used strictly for qualitative discourse analysis.</w:t>
       </w:r>
       <w:r>
         <w:rPr>
@@ -2729,7 +2728,7 @@
           <w:szCs w:val="22"/>
           <w:rtl w:val="0"/>
         </w:rPr>
-        <w:t xml:space="preserve">Dimova, A. (2024). </w:t>
+        <w:t>Koteyko, N., &amp; Atanasova, D. (2018). Mental health advocacy on Twitter: Positioning in Depression Awareness Week tweets. Discourse, Context &amp; Media, 25, 52–59. https://doi.org/10.1016/j.dcm.2018.04.007</w:t>
       </w:r>
       <w:r>
         <w:rPr>
@@ -2740,16 +2739,14 @@
           <w:szCs w:val="22"/>
           <w:rtl w:val="0"/>
         </w:rPr>
-        <w:t xml:space="preserve">Mental health advocacy on social media: A multimodal discourse analysis</w:t>
-      </w:r>
-      <w:r>
-        <w:rPr>
-          <w:rFonts w:ascii="Georgia" w:cs="Georgia" w:eastAsia="Georgia" w:hAnsi="Georgia"/>
-          <w:sz w:val="22"/>
-          <w:szCs w:val="22"/>
-          <w:rtl w:val="0"/>
-        </w:rPr>
-        <w:t xml:space="preserve"> [Doctoral dissertation, Queen Mary University of London]. Queen Mary Research Online. https://qmro.qmul.ac.uk/xmlui/handle/123456789/97828</w:t>
+      </w:r>
+      <w:r>
+        <w:rPr>
+          <w:rFonts w:ascii="Georgia" w:cs="Georgia" w:eastAsia="Georgia" w:hAnsi="Georgia"/>
+          <w:sz w:val="22"/>
+          <w:szCs w:val="22"/>
+          <w:rtl w:val="0"/>
+        </w:rPr>
       </w:r>
       <w:r>
         <w:rPr>

</xml_diff>

<commit_message>
Revise BOTS opening: fold real citations, drop Dimova framing
Insert agreed opening (struggle/hope hook + Wu & Hong, Koinig, Naslund
2016, Koteyko & Atanasova). Correct Naslund year 2020→2016 in text and
reference list.
</commit_message>
<xml_diff>
--- a/thesis/Thesis_Proposal_Instagram_MH_v07.docx
+++ b/thesis/Thesis_Proposal_Instagram_MH_v07.docx
@@ -450,7 +450,10 @@
           <w:szCs w:val="22"/>
           <w:rtl w:val="0"/>
         </w:rPr>
-        <w:t>Instagram has emerged as a significant platform for public mental health communication, with dedicated advocacy pages producing high-volume, high-engagement content that consistently employs positive linguistic framing (Wu &amp; Hong, 2022; Koinig, 2022). Research confirms that mental health-related posts on Instagram are predominantly oriented toward encouragement, recovery, and community support, and that such content attracts substantial audience interaction (Naslund et al., 2020; Wu &amp; Hong, 2022). These captions operate as concise discursive units in which lexical choices, modality, and directive structures converge to produce specific social meanings in a digitally mediated public space. Despite this documented prevalence, the specific lexical and grammatical mechanisms through which such short-form texts construct hope and empowerment remain underexamined within the applied linguistics and discourse analysis literature.</w:t>
+        <w:t>Struggle is often easy to name. Hope is harder to construct in words without sounding false.</w:t>
+        <w:br/>
+        <w:br/>
+        <w:t>On Instagram, dedicated mental health advocacy pages produce high-volume, high-engagement content that consistently uses positive linguistic framing. Wu and Hong (2022), analysing over 7,000 #mentalhealth posts, found that the majority of captions and comments carried positive sentiment and that images with human faces attracted more likes, comments, and positive responses. Koinig (2022) likewise showed that motivational quotes and influencer posts—formats that emphasise encouragement and relatability—received the most favourable evaluations from young Instagram users. Naslund et al. (2016) observed that people with mental illness increasingly turn to social media for peer-to-peer support, finding greater social connectedness and opportunities to challenge stigma. These captions function as concise discursive units in which lexical choices, modality, and directive structures work together to produce specific social meanings. Discourse-analytic work on related platforms has begun to show how advocacy actors position audiences and construct collective support through language and multimodal resources (Koteyko &amp; Atanasova, 2018). Despite this documented prevalence, the specific lexical and grammatical mechanisms through which short-form Instagram captions construct hope and empowerment remain underexamined in applied linguistics and discourse analysis.</w:t>
       </w:r>
       <w:r>
         <w:rPr>
@@ -483,7 +486,7 @@
           <w:szCs w:val="22"/>
           <w:rtl w:val="0"/>
         </w:rPr>
-        <w:t xml:space="preserve">This study addresses that gap by examining how mental health captions on Instagram use lexical and grammatical choices to construct two discursive orientations: hope construction and empowerment language; by identifying the linguistic features that characterize public comment responses to those captions; and by describing what these two levels of analysis, taken together, reveal about the collective construction of positive mental health discourse in digital advocacy spaces. The analysis is grounded in Positive Discourse Analysis (Martin, 2004) and draws on an adapted version of Chang's (2009) online support typology. Rather than assuming that positive framing in Instagram captions is inherently beneficial, the study treats positivity as a discursive construction to be described and interrogated on its own terms.</w:t>
+        <w:t>This study addresses that gap by examining how mental health captions on Instagram use lexical and grammatical choices to construct two discursive orientations—hope construction and empowerment language; by identifying the linguistic features that characterise public comment responses to those captions; and by describing what these two levels of analysis, taken together, reveal about the collective construction of positive mental health discourse in digital advocacy spaces. The analysis is grounded in Positive Discourse Analysis (Martin, 2004) and draws on an adapted version of Chang’s (2009) online support typology. Rather than assuming that positive framing in Instagram captions is inherently beneficial, the study treats positivity as a discursive construction to be described and interrogated on its own terms.</w:t>
       </w:r>
       <w:r>
         <w:rPr>
@@ -595,7 +598,7 @@
           <w:szCs w:val="22"/>
           <w:rtl w:val="0"/>
         </w:rPr>
-        <w:t xml:space="preserve">However, this study does not adopt PDA uncritically. Several scholars have noted that an exclusive focus on "positive" discourse risks naturalizing particular framings without interrogating whose positivity is centered or whose experiences are marginalized (Bartesaghi &amp; Castor, 2008; Macgilchrist, 2007). In the specific context of Instagram mental health content, this concern is substantive: empirical and critical media studies have documented that social media wellness discourse can reproduce toxic positivity, commodify recovery language, and sideline clinical or diagnostic complexity (Naslund et al., 2020; Yao &amp; Zhong, 2014). This study applies PDA instrumentally as an analytical instrument to identify and categorize linguistic strategies, while acknowledging that “positive” framing is itself a constructed, selective discourse practice.</w:t>
+        <w:t>However, this study does not adopt PDA uncritically. Several scholars have noted that an exclusive focus on "positive" discourse risks naturalizing particular framings without interrogating whose positivity is centered or whose experiences are marginalized (Bartesaghi &amp; Castor, 2008; Macgilchrist, 2007). In the specific context of Instagram mental health content, this concern is substantive: empirical and critical media studies have documented that social media wellness discourse can reproduce toxic positivity, commodify recovery language, and sideline clinical or diagnostic complexity (Naslund et al., 2016; Yao &amp; Zhong, 2014). This study applies PDA instrumentally as an analytical instrument to identify and categorize linguistic strategies, while acknowledging that “positive” framing is itself a constructed, selective discourse practice.</w:t>
       </w:r>
       <w:r>
         <w:rPr>
@@ -742,7 +745,7 @@
           <w:szCs w:val="22"/>
           <w:rtl w:val="0"/>
         </w:rPr>
-        <w:t xml:space="preserve">Audience responses to mental health content follow recognizable linguistic patterns. Chang (2009), analyzing communication within an online psychosis support group, identified four primary support types: informational support, emotional support, esteem support, and network support. Subsequent digital discourse studies have found that comment sections often mirror the discursive stance of the original post, with emotional and network support dominating wellness communities (Naslund et al., 2020).</w:t>
+        <w:t>Audience responses to mental health content follow recognizable linguistic patterns. Chang (2009), analyzing communication within an online psychosis support group, identified four primary support types: informational support, emotional support, esteem support, and network support. Subsequent digital discourse studies have found that comment sections often mirror the discursive stance of the original post, with emotional and network support dominating wellness communities (Naslund et al., 2016).</w:t>
       </w:r>
       <w:r>
         <w:rPr>
@@ -2938,7 +2941,7 @@
           <w:szCs w:val="22"/>
           <w:rtl w:val="0"/>
         </w:rPr>
-        <w:t xml:space="preserve">Naslund, J. A., Aschbrenner, K. A., Marsch, L. A., &amp; Bartels, S. J. (2020). The future of mental health care: Peer-to-peer support and social media. </w:t>
+        <w:t>Naslund, J. A., Aschbrenner, K. A., Marsch, L. A., &amp; Bartels, S. J. (2016). The future of mental health care: Peer-to-peer support and social media. Epidemiology and Psychiatric Sciences, 25(2), 113–122. https://doi.org/10.1017/S2045796015001067</w:t>
       </w:r>
       <w:r>
         <w:rPr>
@@ -2949,16 +2952,14 @@
           <w:szCs w:val="22"/>
           <w:rtl w:val="0"/>
         </w:rPr>
-        <w:t xml:space="preserve">Epidemiology and Psychiatric Sciences, 25</w:t>
-      </w:r>
-      <w:r>
-        <w:rPr>
-          <w:rFonts w:ascii="Georgia" w:cs="Georgia" w:eastAsia="Georgia" w:hAnsi="Georgia"/>
-          <w:sz w:val="22"/>
-          <w:szCs w:val="22"/>
-          <w:rtl w:val="0"/>
-        </w:rPr>
-        <w:t xml:space="preserve">(2), 113–122. https://doi.org/10.1017/S2045796015001067</w:t>
+      </w:r>
+      <w:r>
+        <w:rPr>
+          <w:rFonts w:ascii="Georgia" w:cs="Georgia" w:eastAsia="Georgia" w:hAnsi="Georgia"/>
+          <w:sz w:val="22"/>
+          <w:szCs w:val="22"/>
+          <w:rtl w:val="0"/>
+        </w:rPr>
       </w:r>
       <w:r>
         <w:rPr>

</xml_diff>

<commit_message>
Revise PDA framework section; add Bartlett, toxic-positivity refs
Force-add Bartlett (2012), Lecompte-Van Poucke (2022), Wong et al. (2025).
Rewrite BOTS PDA paragraphs: Martin/Macgilchrist/Bartlett for framework;
Lecompte-Van Poucke + Wong for toxic-positivity caution; drop Yao & Zhong
misuse. Hedge-thesis cadence (tension, concrete findings, clear stance).
</commit_message>
<xml_diff>
--- a/thesis/Thesis_Proposal_Instagram_MH_v07.docx
+++ b/thesis/Thesis_Proposal_Instagram_MH_v07.docx
@@ -532,7 +532,7 @@
           <w:szCs w:val="22"/>
           <w:rtl w:val="0"/>
         </w:rPr>
-        <w:t xml:space="preserve">This study is grounded in Positive Discourse Analysis (PDA), a framework developed by Martin (2004) within Systemic Functional Linguistics (SFL). Unlike critical discourse approaches that foreground power asymmetries, inequality, or problematization, PDA examines how language resources construct solidarity, hope, agency, and constructive social action. Martin (2004) demonstrates that specific linguistic choices, including forward-looking modality, inclusive pronouns, and action-oriented verbs, actively build positive social meanings. PDA has since been applied to institutional, educational, and digital texts to trace how language fosters resilience and collective support (see Macgilchrist, 2007; Bartesaghi &amp; Castor, 2008).</w:t>
+        <w:t>This study is grounded in Positive Discourse Analysis (PDA), a framework developed by Martin (2004) within Systemic Functional Linguistics. Where critical approaches foreground power and inequality, PDA examines how language builds solidarity, hope, agency, and constructive social action. Martin (2004) shows that choices such as forward-looking modality, inclusive pronouns, and action-oriented verbs can actively construct positive social meanings rather than merely describe them. Macgilchrist (2007) extends that project by showing how marginal discourses can reframe dominant media frames through strategies such as radical reframing. Bartlett (2012) further develops PDA as a context-sensitive method: positive discourse is not treated as automatically progressive, but as hybrid and collaborative, shaped by the local conditions in which speakers act.</w:t>
       </w:r>
       <w:r>
         <w:rPr>
@@ -565,7 +565,7 @@
           <w:szCs w:val="22"/>
           <w:rtl w:val="0"/>
         </w:rPr>
-        <w:t xml:space="preserve">For this study, PDA provides a structured linguistic framework to identify how mental health captions encode optimism (hope construction) and agency (empowerment language) through specific grammatical and lexical patterns. The framework is particularly suited to short-form digital texts because it prioritizes discursive function over isolated keywords, allowing for context-sensitive coding of meaning-making strategies.</w:t>
+        <w:t>For this study, PDA supplies a structured way to identify how mental health captions encode optimism (hope construction) and agency (empowerment language) through specific grammatical and lexical patterns. Because the framework prioritises discursive function over isolated keywords, it fits short-form Instagram captions, where meaning is built in limited space and under platform norms of visibility and engagement.</w:t>
       </w:r>
       <w:r>
         <w:rPr>
@@ -598,7 +598,7 @@
           <w:szCs w:val="22"/>
           <w:rtl w:val="0"/>
         </w:rPr>
-        <w:t>However, this study does not adopt PDA uncritically. Several scholars have noted that an exclusive focus on "positive" discourse risks naturalizing particular framings without interrogating whose positivity is centered or whose experiences are marginalized (Bartesaghi &amp; Castor, 2008; Macgilchrist, 2007). In the specific context of Instagram mental health content, this concern is substantive: empirical and critical media studies have documented that social media wellness discourse can reproduce toxic positivity, commodify recovery language, and sideline clinical or diagnostic complexity (Naslund et al., 2016; Yao &amp; Zhong, 2014). This study applies PDA instrumentally as an analytical instrument to identify and categorize linguistic strategies, while acknowledging that “positive” framing is itself a constructed, selective discourse practice.</w:t>
+        <w:t>This study does not adopt PDA uncritically. An exclusive focus on “positive” discourse can naturalise particular framings and leave unexamined whose positivity is centred or whose experience is sidelined (Macgilchrist, 2007; Bartesaghi &amp; Castor, 2008; Bartlett, 2012). On social media that risk is concrete. Lecompte-Van Poucke (2022), analysing endometriosis awareness pages on Facebook, shows how forced positive discourse—cliché uplift, neoliberal “positive thinking,” and illogical reassurance—can reduce genuine compassion and make platforms less inclusive. Wong, Wan, and Lew (2025) find that toxic positivity on social media is marked by overgeneralisation and commanding language, and that audiences often experience it as ignoring negativity and as a display of privilege; under those conditions, intended emotional contagion fails. Naslund et al. (2016) likewise note that peer support online can challenge stigma and build connectedness, yet the same spaces can also circulate selective recovery narratives. The present study therefore uses PDA as an analytical instrument to describe how hope and empowerment are linguistically constructed, while treating positivity itself as a selective discourse practice rather than an assumed good.</w:t>
       </w:r>
       <w:r>
         <w:rPr>
@@ -620,7 +620,7 @@
           <w:szCs w:val="22"/>
           <w:rtl w:val="0"/>
         </w:rPr>
-        <w:t xml:space="preserve">To analyze how audiences linguistically respond to these PDA-consistent caption strategies, this study integrates Chang’s (2009) online support typology as a complementary analytical instrument. Chang (2009) identified four functional categories of supportive language in computer-mediated communication — informational, emotional, esteem, and network support — originally applied to a Taiwanese text-based psychosis peer support group. The present study adapts this typology for the Instagram advocacy context, collapsing emotional and esteem support into a unified “supportive lexicon” category and operationalizing network support as “personal narrative framing,” given the distinct interactional norms of public social media comment sections. Pairing PDA with Chang’s (2009) adapted typology allows the study to move beyond caption-level analysis and examine whether particular caption strategies co-occur with particular comment response types, making the analytical framework responsive to both production and reception dimensions of digital mental health discourse.</w:t>
+        <w:t>To analyse how audiences respond linguistically to these caption strategies, the study pairs PDA with an adapted version of Chang’s (2009) online support typology. Chang identified four support types in a psychosis peer group—informational, emotional, esteem, and network support. Here, emotional and esteem support are collapsed into a single “supportive lexicon” category, and network support is operationalised as “personal narrative framing,” reflecting the interactional norms of public Instagram comment sections. Informational support is set aside as primary coding because it is less prevalent in advocacy-page comments. The combined framework lets the study move from caption production to comment reception and ask whether particular hope and empowerment strategies co-occur with particular response types.</w:t>
       </w:r>
       <w:r>
         <w:rPr>

</xml_diff>

<commit_message>
Expound PDA section: analyse each study, not name-drop
Martin (Stolen Generations, genre/appraisal); Macgilchrist (five
reframing strategies); Bartlett (hybrid voices, collaborative power);
Lecompte-Van Poucke (forced positivity on endometriosis Facebook);
Wong et al. (overgeneralisation, commanding language, privilege);
Chang (network sparsity, four support types). Hedge-thesis cadence.
</commit_message>
<xml_diff>
--- a/thesis/Thesis_Proposal_Instagram_MH_v07.docx
+++ b/thesis/Thesis_Proposal_Instagram_MH_v07.docx
@@ -532,7 +532,13 @@
           <w:szCs w:val="22"/>
           <w:rtl w:val="0"/>
         </w:rPr>
-        <w:t>This study is grounded in Positive Discourse Analysis (PDA), a framework developed by Martin (2004) within Systemic Functional Linguistics. Where critical approaches foreground power and inequality, PDA examines how language builds solidarity, hope, agency, and constructive social action. Martin (2004) shows that choices such as forward-looking modality, inclusive pronouns, and action-oriented verbs can actively construct positive social meanings rather than merely describe them. Macgilchrist (2007) extends that project by showing how marginal discourses can reframe dominant media frames through strategies such as radical reframing. Bartlett (2012) further develops PDA as a context-sensitive method: positive discourse is not treated as automatically progressive, but as hybrid and collaborative, shaped by the local conditions in which speakers act.</w:t>
+        <w:t>This study is grounded in Positive Discourse Analysis (PDA), a framework developed by Martin (2004) within Systemic Functional Linguistics. Where critical discourse analysis typically deconstructs language in the service of power, Martin proposes a complementary orientation: analysis of the discourses that “make the world a better place.” In his account, solidarity and change are built through concrete linguistic resources—genre renovation, evaluative language (appraisal), and narrative. His central illustrations include the Bringing Them Home report on the Stolen Generations, where new genres and evaluative choices work to reposition Indigenous and non-Indigenous relations rather than only expose injustice. PDA, on this view, is not a soft alternative to critique; it is an analytical commitment to describing how constructive social meanings are actually realised in text.</w:t>
+        <w:br/>
+        <w:br/>
+        <w:t>Subsequent work has tested and refined that commitment. Macgilchrist (2007) takes up Martin’s call by examining how marginal discourses enter mainstream news. Analysing coverage of the Russian–Chechen conflict and related cases, she identifies five counter-discursive strategies—logical inversion, parody, complexification, partial reframing, and radical reframing—and shows that only certain reframings survive editorial selection. Radical reframing, which redefines the terms of the issue rather than merely contradicting the dominant frame, proves the most effective at shifting what can be said. The study matters for mental health advocacy because it demonstrates that “positive” discourse is not automatically published or heard; it has to negotiate institutional filters.</w:t>
+        <w:br/>
+        <w:br/>
+        <w:t>Bartlett (2012) pushes the framework further. In Hybrid Voices and Collaborative Change he argues that early PDA risked an oppositional mirror image of CDA—celebrating minority voices without enough attention to context and power as multifaceted. Drawing on an extended case of intercultural development discourse, Bartlett models power as potentially collaborative as well as coercive, and treats positive discourse as hybrid: speakers draw on multiple voices and local constraints when they attempt change. For the present study, that means hope and empowerment language on Instagram cannot be coded as inherently progressive; they must be described in relation to platform norms, advocacy goals, and audience response.</w:t>
       </w:r>
       <w:r>
         <w:rPr>
@@ -565,7 +571,7 @@
           <w:szCs w:val="22"/>
           <w:rtl w:val="0"/>
         </w:rPr>
-        <w:t>For this study, PDA supplies a structured way to identify how mental health captions encode optimism (hope construction) and agency (empowerment language) through specific grammatical and lexical patterns. Because the framework prioritises discursive function over isolated keywords, it fits short-form Instagram captions, where meaning is built in limited space and under platform norms of visibility and engagement.</w:t>
+        <w:t>For this study, PDA supplies a structured way to identify how mental health captions encode optimism (hope construction) and agency (empowerment language) through specific grammatical and lexical patterns. Martin’s emphasis on modality, inclusive pronouns, and action-oriented processes, Macgilchrist’s attention to reframing, and Bartlett’s insistence on hybrid, context-bound meaning-making together justify treating short-form Instagram captions as sites where positive social meanings are actively built—not merely asserted. Because the framework prioritises discursive function over isolated keywords, it fits a platform where meaning is constructed in limited space and under strong norms of visibility and engagement.</w:t>
       </w:r>
       <w:r>
         <w:rPr>
@@ -598,7 +604,13 @@
           <w:szCs w:val="22"/>
           <w:rtl w:val="0"/>
         </w:rPr>
-        <w:t>This study does not adopt PDA uncritically. An exclusive focus on “positive” discourse can naturalise particular framings and leave unexamined whose positivity is centred or whose experience is sidelined (Macgilchrist, 2007; Bartesaghi &amp; Castor, 2008; Bartlett, 2012). On social media that risk is concrete. Lecompte-Van Poucke (2022), analysing endometriosis awareness pages on Facebook, shows how forced positive discourse—cliché uplift, neoliberal “positive thinking,” and illogical reassurance—can reduce genuine compassion and make platforms less inclusive. Wong, Wan, and Lew (2025) find that toxic positivity on social media is marked by overgeneralisation and commanding language, and that audiences often experience it as ignoring negativity and as a display of privilege; under those conditions, intended emotional contagion fails. Naslund et al. (2016) likewise note that peer support online can challenge stigma and build connectedness, yet the same spaces can also circulate selective recovery narratives. The present study therefore uses PDA as an analytical instrument to describe how hope and empowerment are linguistically constructed, while treating positivity itself as a selective discourse practice rather than an assumed good.</w:t>
+        <w:t>This study does not adopt PDA uncritically. An exclusive focus on “positive” discourse can naturalise particular framings and leave unexamined whose positivity is centred or whose experience is sidelined. Bartesaghi and Castor (2008), working within social constructionism as practical theory, stress that communication research must keep materiality, agency, and critical application in view; otherwise constructionist accounts risk treating discourse as free-floating and politically neutral. Macgilchrist (2007) and Bartlett (2012) raise the same caution from inside PDA itself: positive discourse is selective, and analysis that only praises it can reproduce the exclusions it claims to overcome.</w:t>
+        <w:br/>
+        <w:br/>
+        <w:t>On social media that risk is concrete. Lecompte-Van Poucke (2022) analyses posts and comments on two public Facebook pages advocating for endometriosis awareness. Combining systemic functional linguistics, pragma-dialectics, and critical theory, she shows that both organisational posts and user replies frequently deploy forced positive discourse—cliché uplift, neoliberal “positive thinking,” and argumentatively weak reassurance. The effect is a less inclusive space: distress is met with formulas that are hard to refute yet offer little genuine alignment with the speaker’s situation. Wong, Wan, and Lew (2025) examine toxic positivity more broadly on social media through focus groups and experiment. They find that audiences recognise toxic positivity through two message features—overgeneralisation and commanding language—and two psychological processes—ignoring negativity and perceived poster privilege. Under those conditions, intended emotional contagion fails; positivity backfires. Naslund et al. (2016), reviewing peer-to-peer support online, similarly note that such spaces can increase connectedness and challenge stigma, yet they can also circulate selective recovery narratives that do not represent the full range of lived experience.</w:t>
+        <w:br/>
+        <w:br/>
+        <w:t>Taken together, these studies justify an instrumental use of PDA in the present project: the framework is used to describe how hope and empowerment are linguistically constructed in Instagram captions, while positivity itself is treated as a selective discourse practice rather than an assumed good.</w:t>
       </w:r>
       <w:r>
         <w:rPr>
@@ -620,7 +632,10 @@
           <w:szCs w:val="22"/>
           <w:rtl w:val="0"/>
         </w:rPr>
-        <w:t>To analyse how audiences respond linguistically to these caption strategies, the study pairs PDA with an adapted version of Chang’s (2009) online support typology. Chang identified four support types in a psychosis peer group—informational, emotional, esteem, and network support. Here, emotional and esteem support are collapsed into a single “supportive lexicon” category, and network support is operationalised as “personal narrative framing,” reflecting the interactional norms of public Instagram comment sections. Informational support is set aside as primary coding because it is less prevalent in advocacy-page comments. The combined framework lets the study move from caption production to comment reception and ask whether particular hope and empowerment strategies co-occur with particular response types.</w:t>
+        <w:t>To analyse how audiences respond linguistically to these caption strategies, the study pairs PDA with an adapted version of Chang’s (2009) online support typology. Chang examined communication in a Taiwanese psychosis peer-support board using a network approach. She identified four primary support types—informational, emotional, esteem, and network support—and showed that support exchanges were sparse and unevenly distributed: a minority of participants occupied central positions, while many ties remained uniplex rather than multiplex. The typology therefore captures not only what is said but how support circulates among participants.</w:t>
+        <w:br/>
+        <w:br/>
+        <w:t>The present study adapts that typology to public Instagram advocacy comments. Emotional and esteem support are collapsed into a single “supportive lexicon” category, reflecting the short, affective replies typical of the platform. Network support is operationalised as “personal narrative framing,” where commenters offer their own experience as alignment rather than advice. Informational support is set aside as a primary coding category because it is less prevalent under advocacy-page norms. Pairing PDA with this adapted typology allows the analysis to move from caption production to comment reception and to ask whether particular hope and empowerment strategies co-occur with particular response types.</w:t>
       </w:r>
       <w:r>
         <w:rPr>

</xml_diff>

<commit_message>
Align opening BOTS and PDA section with style prefs and tense matrix
Remove em-dashes and semicolons. Use present and present perfect for
current facts and continuing trends. Short-to-medium sentences,
Philippine English B1-B2, hedge-thesis cadence. Substance of cited
studies retained.
</commit_message>
<xml_diff>
--- a/thesis/Thesis_Proposal_Instagram_MH_v07.docx
+++ b/thesis/Thesis_Proposal_Instagram_MH_v07.docx
@@ -453,7 +453,7 @@
         <w:t>Struggle is often easy to name, but hope is harder to construct in words without sounding false.</w:t>
         <w:br/>
         <w:br/>
-        <w:t>On Instagram, dedicated mental health advocacy pages produce high-volume, high-engagement content that consistently uses positive linguistic framing. Wu and Hong (2022), analysing over 7,000 #mentalhealth posts, found that the majority of captions and comments carried positive sentiment and that images with human faces attracted more likes, comments, and positive responses. Koinig (2022) likewise showed that motivational quotes and influencer posts—formats that emphasise encouragement and relatability—received the most favourable evaluations from young Instagram users. Naslund et al. (2016) observed that people with mental illness increasingly turn to social media for peer-to-peer support, finding greater social connectedness and opportunities to challenge stigma. These captions function as concise discursive units in which lexical choices, modality, and directive structures work together to produce specific social meanings. Discourse-analytic work on related platforms has begun to show how advocacy actors position audiences and construct collective support through language and multimodal resources (Koteyko &amp; Atanasova, 2018). Despite this documented prevalence, the specific lexical and grammatical mechanisms through which short-form Instagram captions construct hope and empowerment remain underexamined in applied linguistics and discourse analysis.</w:t>
+        <w:t>On Instagram, dedicated mental health advocacy pages produce high-volume, high-engagement content that consistently uses positive linguistic framing. Wu and Hong (2022) analysed more than 7,000 #mentalhealth posts and found that most captions and comments carried positive sentiment. Posts with human faces also drew more likes, comments, and positive replies. Koinig (2022) surveyed active Instagram users and reported that motivational quotes and influencer posts received the strongest favourable evaluations. Naslund et al. (2016) observed that people with mental illness increasingly turn to social media for peer support. They find greater social connectedness and more chances to challenge stigma. These captions work as short discursive units. Lexical choices, modality, and directive structures combine to produce specific social meanings. Related work on Twitter has shown how advocacy actors position audiences and build collective support through language and multimodal resources (Koteyko &amp; Atanasova, 2018). Even so, the specific lexical and grammatical mechanisms through which short Instagram captions construct hope and empowerment remain underexamined in applied linguistics and discourse analysis.</w:t>
       </w:r>
       <w:r>
         <w:rPr>
@@ -486,7 +486,7 @@
           <w:szCs w:val="22"/>
           <w:rtl w:val="0"/>
         </w:rPr>
-        <w:t>This study addresses that gap by examining how mental health captions on Instagram use lexical and grammatical choices to construct two discursive orientations—hope construction and empowerment language; by identifying the linguistic features that characterise public comment responses to those captions; and by describing what these two levels of analysis, taken together, reveal about the collective construction of positive mental health discourse in digital advocacy spaces. The analysis is grounded in Positive Discourse Analysis (Martin, 2004) and draws on an adapted version of Chang’s (2009) online support typology. Rather than assuming that positive framing in Instagram captions is inherently beneficial, the study treats positivity as a discursive construction to be described and interrogated on its own terms.</w:t>
+        <w:t>This study addresses that gap. It examines how mental health captions on Instagram use lexical and grammatical choices to construct two discursive orientations, hope construction and empowerment language. It also identifies the linguistic features that characterise public comment responses to those captions. Taken together, the two levels of analysis describe how positive mental health discourse is collectively constructed in digital advocacy spaces. The analysis is grounded in Positive Discourse Analysis (Martin, 2004) and draws on an adapted version of Chang’s (2009) online support typology. The study does not assume that positive framing is inherently beneficial. It treats positivity as a discursive construction to be described and interrogated on its own terms.</w:t>
       </w:r>
       <w:r>
         <w:rPr>
@@ -532,13 +532,13 @@
           <w:szCs w:val="22"/>
           <w:rtl w:val="0"/>
         </w:rPr>
-        <w:t>This study is grounded in Positive Discourse Analysis (PDA), a framework developed by Martin (2004) within Systemic Functional Linguistics. Where critical discourse analysis typically deconstructs language in the service of power, Martin proposes a complementary orientation: analysis of the discourses that “make the world a better place.” In his account, solidarity and change are built through concrete linguistic resources—genre renovation, evaluative language (appraisal), and narrative. His central illustrations include the Bringing Them Home report on the Stolen Generations, where new genres and evaluative choices work to reposition Indigenous and non-Indigenous relations rather than only expose injustice. PDA, on this view, is not a soft alternative to critique; it is an analytical commitment to describing how constructive social meanings are actually realised in text.</w:t>
+        <w:t>This study is grounded in Positive Discourse Analysis (PDA), a framework developed by Martin (2004) within Systemic Functional Linguistics. Critical discourse analysis often focuses on language in the service of power. Martin offers a complementary orientation. He examines discourses that work to make the world better. Solidarity and change, in his account, are built through concrete linguistic resources. These include genre renovation, evaluative language under the appraisal framework, and narrative. His central illustrations include the Bringing Them Home report on the Stolen Generations. There, new genres and evaluative choices reposition Indigenous and non-Indigenous relations rather than only expose injustice. PDA is not a soft alternative to critique. It is an analytical commitment to describing how constructive social meanings are realised in text.</w:t>
         <w:br/>
         <w:br/>
-        <w:t>Subsequent work has tested and refined that commitment. Macgilchrist (2007) takes up Martin’s call by examining how marginal discourses enter mainstream news. Analysing coverage of the Russian–Chechen conflict and related cases, she identifies five counter-discursive strategies—logical inversion, parody, complexification, partial reframing, and radical reframing—and shows that only certain reframings survive editorial selection. Radical reframing, which redefines the terms of the issue rather than merely contradicting the dominant frame, proves the most effective at shifting what can be said. The study matters for mental health advocacy because it demonstrates that “positive” discourse is not automatically published or heard; it has to negotiate institutional filters.</w:t>
+        <w:t>Later work has tested and refined that commitment. Macgilchrist (2007) takes up Martin’s call by examining how marginal discourses enter mainstream news. She analyses coverage of the Russian-Chechen conflict and related cases. She identifies five counter-discursive strategies. These are logical inversion, parody, complexification, partial reframing, and radical reframing. Only certain reframings survive editorial selection. Radical reframing, which redefines the terms of the issue rather than merely contradicting the dominant frame, proves the most effective at shifting what can be said. The study matters for mental health advocacy because it shows that positive discourse is not automatically published or heard. It has to negotiate institutional filters.</w:t>
         <w:br/>
         <w:br/>
-        <w:t>Bartlett (2012) pushes the framework further. In Hybrid Voices and Collaborative Change he argues that early PDA risked an oppositional mirror image of CDA—celebrating minority voices without enough attention to context and power as multifaceted. Drawing on an extended case of intercultural development discourse, Bartlett models power as potentially collaborative as well as coercive, and treats positive discourse as hybrid: speakers draw on multiple voices and local constraints when they attempt change. For the present study, that means hope and empowerment language on Instagram cannot be coded as inherently progressive; they must be described in relation to platform norms, advocacy goals, and audience response.</w:t>
+        <w:t>Bartlett (2012) pushes the framework further. In Hybrid Voices and Collaborative Change he argues that early PDA risked becoming an oppositional mirror of critical discourse analysis. It could celebrate minority voices without enough attention to context. Drawing on an extended case of intercultural development discourse, Bartlett models power as potentially collaborative as well as coercive. He treats positive discourse as hybrid. Speakers draw on multiple voices and local constraints when they attempt change. For the present study, that means hope and empowerment language on Instagram cannot be coded as inherently progressive. They must be described in relation to platform norms, advocacy goals, and audience response.</w:t>
       </w:r>
       <w:r>
         <w:rPr>
@@ -571,7 +571,7 @@
           <w:szCs w:val="22"/>
           <w:rtl w:val="0"/>
         </w:rPr>
-        <w:t>For this study, PDA supplies a structured way to identify how mental health captions encode optimism (hope construction) and agency (empowerment language) through specific grammatical and lexical patterns. Martin’s emphasis on modality, inclusive pronouns, and action-oriented processes, Macgilchrist’s attention to reframing, and Bartlett’s insistence on hybrid, context-bound meaning-making together justify treating short-form Instagram captions as sites where positive social meanings are actively built—not merely asserted. Because the framework prioritises discursive function over isolated keywords, it fits a platform where meaning is constructed in limited space and under strong norms of visibility and engagement.</w:t>
+        <w:t>For this study, PDA supplies a structured way to identify how mental health captions encode optimism and agency. Optimism appears as hope construction. Agency appears as empowerment language. Both are tracked through specific grammatical and lexical patterns. Martin’s emphasis on modality, inclusive pronouns, and action-oriented processes, Macgilchrist’s attention to reframing, and Bartlett’s insistence on hybrid, context-bound meaning-making justify treating short Instagram captions as sites where positive social meanings are actively built. The framework prioritises discursive function over isolated keywords. That focus fits a platform where meaning is constructed in limited space and under strong norms of visibility and engagement.</w:t>
       </w:r>
       <w:r>
         <w:rPr>
@@ -604,13 +604,13 @@
           <w:szCs w:val="22"/>
           <w:rtl w:val="0"/>
         </w:rPr>
-        <w:t>This study does not adopt PDA uncritically. An exclusive focus on “positive” discourse can naturalise particular framings and leave unexamined whose positivity is centred or whose experience is sidelined. Bartesaghi and Castor (2008), working within social constructionism as practical theory, stress that communication research must keep materiality, agency, and critical application in view; otherwise constructionist accounts risk treating discourse as free-floating and politically neutral. Macgilchrist (2007) and Bartlett (2012) raise the same caution from inside PDA itself: positive discourse is selective, and analysis that only praises it can reproduce the exclusions it claims to overcome.</w:t>
+        <w:t>This study does not adopt PDA uncritically. An exclusive focus on positive discourse can naturalise particular framings. It can leave unexamined whose positivity is centred and whose experience is sidelined. Bartesaghi and Castor (2008), working within social constructionism as practical theory, stress that communication research must keep materiality, agency, and critical application in view. Otherwise constructionist accounts risk treating discourse as free-floating and politically neutral. Macgilchrist (2007) and Bartlett (2012) raise the same caution from inside PDA itself. Positive discourse is selective. Analysis that only praises it can reproduce the exclusions it claims to overcome.</w:t>
         <w:br/>
         <w:br/>
-        <w:t>On social media that risk is concrete. Lecompte-Van Poucke (2022) analyses posts and comments on two public Facebook pages advocating for endometriosis awareness. Combining systemic functional linguistics, pragma-dialectics, and critical theory, she shows that both organisational posts and user replies frequently deploy forced positive discourse—cliché uplift, neoliberal “positive thinking,” and argumentatively weak reassurance. The effect is a less inclusive space: distress is met with formulas that are hard to refute yet offer little genuine alignment with the speaker’s situation. Wong, Wan, and Lew (2025) examine toxic positivity more broadly on social media through focus groups and experiment. They find that audiences recognise toxic positivity through two message features—overgeneralisation and commanding language—and two psychological processes—ignoring negativity and perceived poster privilege. Under those conditions, intended emotional contagion fails; positivity backfires. Naslund et al. (2016), reviewing peer-to-peer support online, similarly note that such spaces can increase connectedness and challenge stigma, yet they can also circulate selective recovery narratives that do not represent the full range of lived experience.</w:t>
+        <w:t>On social media that risk is concrete. Lecompte-Van Poucke (2022) analyses posts and comments on two public Facebook pages that advocate for endometriosis awareness. She combines systemic functional linguistics, pragma-dialectics, and critical theory. She shows that both organisational posts and user replies often deploy forced positive discourse. This includes cliché uplift, neoliberal positive thinking, and argumentatively weak reassurance. The effect is a less inclusive space. Distress is met with formulas that are hard to refute yet offer little genuine alignment with the speaker’s situation. Wong, Wan, and Lew (2025) examine toxic positivity more broadly on social media through focus groups and experiment. They find that audiences recognise toxic positivity through two message features, overgeneralisation and commanding language, and through two psychological processes, ignoring negativity and perceived poster privilege. Under those conditions, intended emotional contagion fails. Positivity backfires. Naslund et al. (2016), reviewing peer-to-peer support online, note that such spaces can increase connectedness and challenge stigma. They can also circulate selective recovery narratives that do not represent the full range of lived experience.</w:t>
         <w:br/>
         <w:br/>
-        <w:t>Taken together, these studies justify an instrumental use of PDA in the present project: the framework is used to describe how hope and empowerment are linguistically constructed in Instagram captions, while positivity itself is treated as a selective discourse practice rather than an assumed good.</w:t>
+        <w:t>Taken together, these studies justify an instrumental use of PDA in the present project. The framework is used to describe how hope and empowerment are linguistically constructed in Instagram captions. Positivity itself is treated as a selective discourse practice rather than an assumed good.</w:t>
       </w:r>
       <w:r>
         <w:rPr>
@@ -632,10 +632,10 @@
           <w:szCs w:val="22"/>
           <w:rtl w:val="0"/>
         </w:rPr>
-        <w:t>To analyse how audiences respond linguistically to these caption strategies, the study pairs PDA with an adapted version of Chang’s (2009) online support typology. Chang examined communication in a Taiwanese psychosis peer-support board using a network approach. She identified four primary support types—informational, emotional, esteem, and network support—and showed that support exchanges were sparse and unevenly distributed: a minority of participants occupied central positions, while many ties remained uniplex rather than multiplex. The typology therefore captures not only what is said but how support circulates among participants.</w:t>
+        <w:t>To analyse how audiences respond linguistically to these caption strategies, the study pairs PDA with an adapted version of Chang’s (2009) online support typology. Chang examined communication in a Taiwanese psychosis peer-support board using a network approach. She identified four primary support types. These are informational, emotional, esteem, and network support. She also showed that support exchanges were sparse and unevenly distributed. A minority of participants occupied central positions. Many ties remained uniplex rather than multiplex. The typology therefore captures not only what is said but how support circulates among participants.</w:t>
         <w:br/>
         <w:br/>
-        <w:t>The present study adapts that typology to public Instagram advocacy comments. Emotional and esteem support are collapsed into a single “supportive lexicon” category, reflecting the short, affective replies typical of the platform. Network support is operationalised as “personal narrative framing,” where commenters offer their own experience as alignment rather than advice. Informational support is set aside as a primary coding category because it is less prevalent under advocacy-page norms. Pairing PDA with this adapted typology allows the analysis to move from caption production to comment reception and to ask whether particular hope and empowerment strategies co-occur with particular response types.</w:t>
+        <w:t>The present study adapts that typology to public Instagram advocacy comments. Emotional and esteem support are collapsed into a single supportive lexicon category. This reflects the short, affective replies typical of the platform. Network support is operationalised as personal narrative framing, where commenters offer their own experience as alignment rather than advice. Informational support is set aside as a primary coding category because it is less prevalent under advocacy-page norms. Pairing PDA with this adapted typology allows the analysis to move from caption production to comment reception. It asks whether particular hope and empowerment strategies co-occur with particular response types.</w:t>
       </w:r>
       <w:r>
         <w:rPr>

</xml_diff>

<commit_message>
Expound Instagram positivity theme; add Beelen, Natrio, Anake refs
Force-add three PDFs. Rewrite section with analysed findings: Wu & Hong
congruence and faces; Koinig format preferences; Koteyko positioning;
Beelen & Karsay null hope effects; Natrio appraisal healthy self;
Anake social semiotics. Tense matrix, no em-dash/semicolon, prefs.
</commit_message>
<xml_diff>
--- a/thesis/Thesis_Proposal_Instagram_MH_v07.docx
+++ b/thesis/Thesis_Proposal_Instagram_MH_v07.docx
@@ -681,7 +681,10 @@
           <w:szCs w:val="22"/>
           <w:rtl w:val="0"/>
         </w:rPr>
-        <w:t xml:space="preserve">Empirical research on digital mental health discourse confirms that Instagram content is predominantly positive in orientation and is designed to elicit supportive interaction. Wu and Hong (2022) analyzed 7,078 posts tagged #mentalhealth and found that among posts containing human faces (n=1,472), 77.6% expressed positive caption sentiment; comment sections were dominated by supportive lexical items. They also found that when captions and images shared the same emotional tone, readers were more likely to leave positive comments, a finding that foregrounds caption-comment alignment as an empirically observable phenomenon worth investigating linguistically.</w:t>
+        <w:t>Empirical research on digital mental health discourse confirms that Instagram content is predominantly positive in orientation and is designed to elicit supportive interaction. Wu and Hong (2022) scraped all public Instagram posts tagged #mentalhealth on World Mental Health Day and analysed 7,078 posts with a mixed method of automated sentiment classification and quantitative content analysis. The sample contained more positive sentiment in both captions and comments than negative sentiment. Images with human faces drew more likes, more comments, and more positive comments than images without faces. In the subset of 1,472 posts that showed faces, emotional contagion from post to comment appeared only when image sentiment and caption sentiment were congruent. When the two modes shared the same emotional tone, readers were more likely to leave positive comments. That finding makes caption-comment alignment an empirically observable phenomenon and supports treating captions as linguistic units that shape subsequent response.</w:t>
+        <w:br/>
+        <w:br/>
+        <w:t>Koinig (2022) tested how different content formats used by mental health influencers are evaluated by users. A cross-sectional survey of 532 Austrian Instagram users aged 16 to 34 compared motivational quotes, comics, and influencer posts. Motivational quotes received the most favourable evaluations (M = 4.23), followed closely by influencer posts (M = 4.12). Comics scored lower (M = 3.72). Respondents preferred content that boosted esteem or carried a human touch. The study therefore links positive framing not only to platform norms but to audience preference for forms that invite encouragement and relatability.</w:t>
       </w:r>
       <w:r>
         <w:rPr>
@@ -714,7 +717,13 @@
           <w:szCs w:val="22"/>
           <w:rtl w:val="0"/>
         </w:rPr>
-        <w:t>Koinig (2022) surveyed 532 active Instagram users and reported that motivational quotes received higher engagement than other content formats. Koteyko and Atanasova (2018), examining mental health advocacy tweets during Depression Awareness Week, showed how users and organisations deploy positioning strategies and multimodal resources to invite empathy, validate experience, and construct collective support. These studies establish that Instagram and related platforms intentionally use positive framing, but they stop short of categorizing the specific lexical and grammatical strategies through a PDA lens, or mapping how comment language structurally aligns with caption strategies.</w:t>
+        <w:t>Discourse-analytic work on related platforms has examined how advocacy language positions audiences. Koteyko and Atanasova (2018) analysed tweets tagged #WhatYouDontSee during Depression Awareness Week. They show that users and organisations deploy metadata and images for interactional positioning. Audiences are cast as jury, confidantes, or fellow sufferers. Those positions allow users to bear witness, validate experience, and invite judgement. The study highlights the interactional function of digital illness narratives rather than treating posts as isolated sentiment scores.</w:t>
+        <w:br/>
+        <w:br/>
+        <w:t>More recent Instagram-focused work extends that picture. Beelen and Karsay (2024) ran a pre-registered experiment with 479 young adults. They manipulated hopeful mental health messages versus control posts and high versus low endorsement cues on Instagram-style stimuli. They measured effects on hope, life satisfaction, stigma, willingness to disclose, and willingness to support. The analysis found no significant main or interaction effects in the predicted direction. Hopeful content alone did not reliably shift those outcomes under the conditions tested. Natrio and Yensasnidar (2025) applied Appraisal Theory and critical discourse analysis to 26 English Instagram captions tagged with health and lifestyle hashtags. Captions constructed a “healthy self” through affect, judgement, and appreciation. They emphasised emotional recovery, discipline, self-acceptance, and personal empowerment, while still carrying neoliberal values of individual responsibility and bodily control. Anake et al. (2024) used social semiotics on two mental health Instagram accounts. They show how representation, colour, and framing work with language to advocate awareness and support and to shape empathetic understanding.</w:t>
+        <w:br/>
+        <w:br/>
+        <w:t>Together these studies establish that Instagram and related platforms intentionally use positive framing and that audiences respond to format, congruence, and positioning. They stop short of categorising the specific lexical and grammatical strategies of hope and empowerment through a Positive Discourse Analysis lens, or of mapping how comment language structurally aligns with caption strategies. That is the gap this study addresses.</w:t>
       </w:r>
       <w:r>
         <w:rPr>

</xml_diff>

<commit_message>
Expand and revise Comment Response Patterns section in v07 proposal
- Incorporated Kim et al. (2023), Myrick et al. (2015), Wang (2025) findings on emotional-support dominance in digital MH comments
- Preserved Chang (2009) adaptation and coding scheme
- Added the three new citations to the DOCX reference list
- Updated context.md Current focus and Recently completed
</commit_message>
<xml_diff>
--- a/thesis/Thesis_Proposal_Instagram_MH_v07.docx
+++ b/thesis/Thesis_Proposal_Instagram_MH_v07.docx
@@ -769,7 +769,7 @@
           <w:szCs w:val="22"/>
           <w:rtl w:val="0"/>
         </w:rPr>
-        <w:t>Audience responses to mental health content follow recognizable linguistic patterns. Chang (2009), analyzing communication within an online psychosis support group, identified four primary support types: informational support, emotional support, esteem support, and network support. Subsequent digital discourse studies have found that comment sections often mirror the discursive stance of the original post, with emotional and network support dominating wellness communities (Naslund et al., 2016).</w:t>
+        <w:t>Audience responses to mental health content follow recognizable linguistic patterns. Chang (2009) analysed communication within an online psychosis support group and identified four primary support types: informational support, emotional support, esteem support, and network support. Later studies of digital peer support confirm that emotional forms of support appear more often than informational forms in mental health spaces. Kim et al. (2023) scored supporting comments across 55 Reddit mental health communities and found that supporters tend to give emotional support more than informational support. The overall atmosphere of those communities is also emotional. Myrick et al. (2015) proposed a typology that crosses support type (informational or emotional) with direction (expression or reception) in an open Twitter cancer community. Their content analysis shows that short public messages still carry clear support functions even when character limits constrain length. Wang (2025) examined top-ranked posts in a large Weibo depression topic and reported that emotional support requests and provisions dominate, while instrumental support is rare. Naslund et al. (2016) note that people with serious mental illness turn to social media for peer connection and that the resulting exchanges can increase social connectedness and challenge stigma.</w:t>
       </w:r>
       <w:r>
         <w:rPr>
@@ -802,7 +802,7 @@
           <w:szCs w:val="22"/>
           <w:rtl w:val="0"/>
         </w:rPr>
-        <w:t xml:space="preserve">However, most existing analyses treat comments as sentiment data or engagement metrics rather than as structured linguistic responses. This study addresses that gap by applying a focused adaptation of Chang’s (2009) typology: emotional and esteem support are collapsed into a single “supportive lexicon” category, and network support is operationalized as “personal narrative framing.” Informational support is excluded from primary analysis as it is markedly less prevalent in advocacy page comment sections. Identifying the linguistic features of these comment responses is thus central to the second research question and extends existing digital discourse work by treating comment sections as linguistically structured texts rather than mere engagement data. The third research question then draws on both caption and comment findings to describe the collective discursive construction of positive mental health meanings in Instagram advocacy spaces.</w:t>
+        <w:t>Most existing analyses still treat comments mainly as sentiment scores or engagement metrics rather than as structured linguistic responses. This study addresses that gap by applying a focused adaptation of Chang’s (2009) typology. Emotional and esteem support are collapsed into a single “supportive lexicon” category. Network support is operationalized as “personal narrative framing.” Informational support is excluded from the primary analysis because it appears markedly less often in the comment sections of public advocacy pages. The adaptation fits the short, public, and algorithmically ranked nature of Instagram comments. Identifying the linguistic features of these comment responses is central to the second research question. It extends existing digital discourse work by treating comment sections as linguistically structured texts rather than mere engagement data. The third research question then draws on both caption and comment findings to describe the collective discursive construction of positive mental health meanings in Instagram advocacy spaces.</w:t>
       </w:r>
       <w:r>
         <w:rPr>
@@ -3172,6 +3172,21 @@
         <w:rPr>
           <w:rtl w:val="0"/>
         </w:rPr>
+      </w:r>
+    </w:p>
+    <w:p>
+      <w:r>
+        <w:t>Wang, X. (2025). Representing depression in social media: Content analysis of mental support posts on Weibo in China. In Proceedings of the 2025 4th International Conference on Educational Science and Social Culture (ESSC 2025). Atlantis Press.</w:t>
+      </w:r>
+    </w:p>
+    <w:p>
+      <w:r>
+        <w:t>Myrick, J. G., Holton, A. E., Himelboim, I., &amp; Love, B. (2015). #Stupidcancer: Exploring a typology of social support and the role of emotional expression in a social media community. Health Communication, 31(5), 596-605. https://doi.org/10.1080/10410236.2014.981664</w:t>
+      </w:r>
+    </w:p>
+    <w:p>
+      <w:r>
+        <w:t>Kim, M., Saha, K., De Choudhury, M., &amp; Choi, D. (2023). Supporters first: Understanding online social support on mental health from a supporter perspective. Proceedings of the ACM on Human-Computer Interaction, 7(CSCW1), Article 92. https://doi.org/10.1145/3579525</w:t>
       </w:r>
     </w:p>
     <w:p>

</xml_diff>

<commit_message>
Expound Comment Response Patterns: each study examined, not listed
- Chang (2009), Kim et al. (2023), Myrick et al. (2015), Wang (2025), Naslund et al. (2016) each receive method + finding + implication
- Follows hedge-thesis BOTS cadence from thesis-memory as style model
- Note on example repo strengthened in knowledge.md
</commit_message>
<xml_diff>
--- a/thesis/Thesis_Proposal_Instagram_MH_v07.docx
+++ b/thesis/Thesis_Proposal_Instagram_MH_v07.docx
@@ -769,12 +769,27 @@
           <w:szCs w:val="22"/>
           <w:rtl w:val="0"/>
         </w:rPr>
-        <w:t>Audience responses to mental health content follow recognizable linguistic patterns. Chang (2009) analysed communication within an online psychosis support group and identified four primary support types: informational support, emotional support, esteem support, and network support. Later studies of digital peer support confirm that emotional forms of support appear more often than informational forms in mental health spaces. Kim et al. (2023) scored supporting comments across 55 Reddit mental health communities and found that supporters tend to give emotional support more than informational support. The overall atmosphere of those communities is also emotional. Myrick et al. (2015) proposed a typology that crosses support type (informational or emotional) with direction (expression or reception) in an open Twitter cancer community. Their content analysis shows that short public messages still carry clear support functions even when character limits constrain length. Wang (2025) examined top-ranked posts in a large Weibo depression topic and reported that emotional support requests and provisions dominate, while instrumental support is rare. Naslund et al. (2016) note that people with serious mental illness turn to social media for peer connection and that the resulting exchanges can increase social connectedness and challenge stigma.</w:t>
-      </w:r>
-      <w:r>
-        <w:rPr>
-          <w:rtl w:val="0"/>
-        </w:rPr>
+        <w:t>Audience responses to mental health content follow recognizable linguistic patterns. Chang (2009) examined the full sequences of supportive interactions in the PTT psychosis support group in Taiwan over a two-and-a-half-year period. Using a network approach, she mapped how four support types moved through the community: informational support, emotional support, esteem support, and network support. In that specific board the most exchanged types were information and network links. The overall network was sparse and highly centralized, with most exchanges occurring at the dyadic or triadic level. The finding matters because it shows that support type frequency is not universal. It varies with the platform, the illness community, and the structure of interaction.</w:t>
+      </w:r>
+      <w:r>
+        <w:rPr>
+          <w:rtl w:val="0"/>
+        </w:rPr>
+      </w:r>
+    </w:p>
+    <w:p>
+      <w:r>
+        <w:t>Later large-scale work on public mental health forums paints a different picture of what dominates. Kim et al. (2023) collected supporting comments and their target posts from 55 Reddit mental health communities. They trained a deep-learning model to score each comment for informational support and emotional support. The results show that supporters tend to give emotional support more often than informational support. The atmosphere of those communities is also emotional. Heavily supportive users, those with high out-degree in the social supporting network, were more likely to offer informational support with diverse content. Users who attracted large volumes of support tended to post multiple similar requests over time. The study therefore separates the typical emotional climate of peer replies from the more informational style of a smaller set of highly active supporters.</w:t>
+      </w:r>
+    </w:p>
+    <w:p>
+      <w:r>
+        <w:t>Myrick et al. (2015) addressed the problem of classifying support in open, character-limited social media. They proposed a typology that crosses support type (informational or emotional) with direction (expression or reception) and applied it to two years of tweets under the hashtag #stupidcancer. The analysis shows that even short public messages still carry clear support functions. Information giving and link providing appear as expression of informational support. Encouragement, empathy, and religious statements appear as expression of emotional support. Giving thanks functions as reception of emotional support. The typology is useful here because Instagram comments share the same constraints of brevity and public visibility that Twitter posts faced in that study.</w:t>
+      </w:r>
+    </w:p>
+    <w:p>
+      <w:r>
+        <w:t>Wang (2025) analyzed 150 top-ranked posts from Weibo’s Depression Super Topic under the same three-type framework of emotional, informational, and instrumental support. Support-seeking posts far outnumbered support-providing posts. Emotional support requests accounted for the large majority of seeking behavior. Instrumental support provision was entirely absent. The pattern aligns with cultural observations that Chinese users often seek empathy and validation rather than concrete advice or material help in quasi-public depression spaces. Taken together, these studies show that emotional and network-oriented replies are common across platforms, yet the exact balance of support types shifts with community norms, platform affordances, and cultural context.</w:t>
       </w:r>
     </w:p>
     <w:p>
@@ -802,7 +817,7 @@
           <w:szCs w:val="22"/>
           <w:rtl w:val="0"/>
         </w:rPr>
-        <w:t>Most existing analyses still treat comments mainly as sentiment scores or engagement metrics rather than as structured linguistic responses. This study addresses that gap by applying a focused adaptation of Chang’s (2009) typology. Emotional and esteem support are collapsed into a single “supportive lexicon” category. Network support is operationalized as “personal narrative framing.” Informational support is excluded from the primary analysis because it appears markedly less often in the comment sections of public advocacy pages. The adaptation fits the short, public, and algorithmically ranked nature of Instagram comments. Identifying the linguistic features of these comment responses is central to the second research question. It extends existing digital discourse work by treating comment sections as linguistically structured texts rather than mere engagement data. The third research question then draws on both caption and comment findings to describe the collective discursive construction of positive mental health meanings in Instagram advocacy spaces.</w:t>
+        <w:t>Most existing analyses still treat comments mainly as sentiment scores or engagement metrics rather than as structured linguistic responses. Naslund et al. (2016) review the broader evidence that people with serious mental illness turn to social media for peer connection. They report gains in social connectedness, group belonging, and the sharing of coping strategies, alongside the potential to challenge stigma and offer hope. The review remains a perspective piece rather than a linguistic analysis of comment form. This study addresses the resulting gap by applying a focused adaptation of Chang’s (2009) typology to Instagram advocacy comments. Emotional and esteem support are collapsed into a single “supportive lexicon” category. Network support is operationalized as “personal narrative framing.” Informational support is excluded from the primary analysis because it appears markedly less often in the comment sections of public advocacy pages. The adaptation fits the short, public, and algorithmically ranked nature of Instagram comments. Identifying the linguistic features of these comment responses is central to the second research question. It extends existing digital discourse work by treating comment sections as linguistically structured texts rather than mere engagement data. The third research question then draws on both caption and comment findings to describe the collective discursive construction of positive mental health meanings in Instagram advocacy spaces.</w:t>
       </w:r>
       <w:r>
         <w:rPr>

</xml_diff>

<commit_message>
Restore Georgia 11pt and body spacing on expanded Comment Response Patterns paragraphs
</commit_message>
<xml_diff>
--- a/thesis/Thesis_Proposal_Instagram_MH_v07.docx
+++ b/thesis/Thesis_Proposal_Instagram_MH_v07.docx
@@ -765,6 +765,8 @@
       <w:r>
         <w:rPr>
           <w:rFonts w:ascii="Georgia" w:cs="Georgia" w:eastAsia="Georgia" w:hAnsi="Georgia"/>
+          <w:b w:val="0"/>
+          <w:i w:val="0"/>
           <w:sz w:val="22"/>
           <w:szCs w:val="22"/>
           <w:rtl w:val="0"/>
@@ -773,39 +775,59 @@
       </w:r>
       <w:r>
         <w:rPr>
-          <w:rtl w:val="0"/>
-        </w:rPr>
-      </w:r>
-    </w:p>
-    <w:p>
-      <w:r>
+          <w:rFonts w:ascii="Georgia" w:hAnsi="Georgia" w:cs="Georgia"/>
+          <w:b w:val="0"/>
+          <w:i w:val="0"/>
+          <w:sz w:val="22"/>
+          <w:rtl w:val="0"/>
+        </w:rPr>
+      </w:r>
+    </w:p>
+    <w:p>
+      <w:pPr>
+        <w:spacing w:line="480" w:lineRule="auto"/>
+      </w:pPr>
+      <w:r>
+        <w:rPr>
+          <w:rFonts w:ascii="Georgia" w:hAnsi="Georgia" w:cs="Georgia"/>
+          <w:b w:val="0"/>
+          <w:i w:val="0"/>
+          <w:sz w:val="22"/>
+        </w:rPr>
         <w:t>Later large-scale work on public mental health forums paints a different picture of what dominates. Kim et al. (2023) collected supporting comments and their target posts from 55 Reddit mental health communities. They trained a deep-learning model to score each comment for informational support and emotional support. The results show that supporters tend to give emotional support more often than informational support. The atmosphere of those communities is also emotional. Heavily supportive users, those with high out-degree in the social supporting network, were more likely to offer informational support with diverse content. Users who attracted large volumes of support tended to post multiple similar requests over time. The study therefore separates the typical emotional climate of peer replies from the more informational style of a smaller set of highly active supporters.</w:t>
       </w:r>
     </w:p>
     <w:p>
-      <w:r>
+      <w:pPr>
+        <w:spacing w:line="480" w:lineRule="auto"/>
+      </w:pPr>
+      <w:r>
+        <w:rPr>
+          <w:rFonts w:ascii="Georgia" w:hAnsi="Georgia" w:cs="Georgia"/>
+          <w:b w:val="0"/>
+          <w:i w:val="0"/>
+          <w:sz w:val="22"/>
+        </w:rPr>
         <w:t>Myrick et al. (2015) addressed the problem of classifying support in open, character-limited social media. They proposed a typology that crosses support type (informational or emotional) with direction (expression or reception) and applied it to two years of tweets under the hashtag #stupidcancer. The analysis shows that even short public messages still carry clear support functions. Information giving and link providing appear as expression of informational support. Encouragement, empathy, and religious statements appear as expression of emotional support. Giving thanks functions as reception of emotional support. The typology is useful here because Instagram comments share the same constraints of brevity and public visibility that Twitter posts faced in that study.</w:t>
       </w:r>
     </w:p>
     <w:p>
-      <w:r>
+      <w:pPr>
+        <w:spacing w:line="480" w:lineRule="auto"/>
+      </w:pPr>
+      <w:r>
+        <w:rPr>
+          <w:rFonts w:ascii="Georgia" w:hAnsi="Georgia" w:cs="Georgia"/>
+          <w:b w:val="0"/>
+          <w:i w:val="0"/>
+          <w:sz w:val="22"/>
+        </w:rPr>
         <w:t>Wang (2025) analyzed 150 top-ranked posts from Weibo’s Depression Super Topic under the same three-type framework of emotional, informational, and instrumental support. Support-seeking posts far outnumbered support-providing posts. Emotional support requests accounted for the large majority of seeking behavior. Instrumental support provision was entirely absent. The pattern aligns with cultural observations that Chinese users often seek empathy and validation rather than concrete advice or material help in quasi-public depression spaces. Taken together, these studies show that emotional and network-oriented replies are common across platforms, yet the exact balance of support types shifts with community norms, platform affordances, and cultural context.</w:t>
       </w:r>
     </w:p>
     <w:p>
       <w:pPr>
         <w:spacing w:line="480" w:lineRule="auto"/>
-        <w:rPr/>
-      </w:pPr>
-      <w:r>
-        <w:rPr>
-          <w:rtl w:val="0"/>
-        </w:rPr>
-      </w:r>
-    </w:p>
-    <w:p>
-      <w:pPr>
-        <w:spacing w:line="480" w:lineRule="auto"/>
         <w:ind w:firstLine="720"/>
         <w:jc w:val="both"/>
         <w:rPr/>
@@ -813,6 +835,8 @@
       <w:r>
         <w:rPr>
           <w:rFonts w:ascii="Georgia" w:cs="Georgia" w:eastAsia="Georgia" w:hAnsi="Georgia"/>
+          <w:b w:val="0"/>
+          <w:i w:val="0"/>
           <w:sz w:val="22"/>
           <w:szCs w:val="22"/>
           <w:rtl w:val="0"/>
@@ -821,6 +845,10 @@
       </w:r>
       <w:r>
         <w:rPr>
+          <w:rFonts w:ascii="Georgia" w:hAnsi="Georgia" w:cs="Georgia"/>
+          <w:b w:val="0"/>
+          <w:i w:val="0"/>
+          <w:sz w:val="22"/>
           <w:rtl w:val="0"/>
         </w:rPr>
       </w:r>

</xml_diff>

<commit_message>
Connect Struggle opening to following text; set justified on Comment Response paragraphs
</commit_message>
<xml_diff>
--- a/thesis/Thesis_Proposal_Instagram_MH_v07.docx
+++ b/thesis/Thesis_Proposal_Instagram_MH_v07.docx
@@ -450,13 +450,12 @@
           <w:szCs w:val="22"/>
           <w:rtl w:val="0"/>
         </w:rPr>
-        <w:t>Struggle is often easy to name, but hope is harder to construct in words without sounding false.</w:t>
-        <w:br/>
-        <w:br/>
-        <w:t>On Instagram, dedicated mental health advocacy pages produce high-volume, high-engagement content that consistently uses positive linguistic framing. Wu and Hong (2022) analysed more than 7,000 #mentalhealth posts and found that most captions and comments carried positive sentiment. Posts with human faces also drew more likes, comments, and positive replies. Koinig (2022) surveyed active Instagram users and reported that motivational quotes and influencer posts received the strongest favourable evaluations. Naslund et al. (2016) observed that people with mental illness increasingly turn to social media for peer support. They find greater social connectedness and more chances to challenge stigma. These captions work as short discursive units. Lexical choices, modality, and directive structures combine to produce specific social meanings. Related work on Twitter has shown how advocacy actors position audiences and build collective support through language and multimodal resources (Koteyko &amp; Atanasova, 2018). Even so, the specific lexical and grammatical mechanisms through which short Instagram captions construct hope and empowerment remain underexamined in applied linguistics and discourse analysis.</w:t>
-      </w:r>
-      <w:r>
-        <w:rPr>
+        <w:t>Struggle is often easy to name, but hope is harder to construct in words without sounding false. On Instagram, dedicated mental health advocacy pages produce high-volume, high-engagement content that consistently uses positive linguistic framing. Wu and Hong (2022) analysed more than 7,000 #mentalhealth posts and found that most captions and comments carried positive sentiment. Posts with human faces also drew more likes, comments, and positive replies. Koinig (2022) surveyed active Instagram users and reported that motivational quotes and influencer posts received the strongest favourable evaluations. Naslund et al. (2016) observed that people with mental illness increasingly turn to social media for peer support. They find greater social connectedness and more chances to challenge stigma. These captions work as short discursive units. Lexical choices, modality, and directive structures combine to produce specific social meanings. Related work on Twitter has shown how advocacy actors position audiences and build collective support through language and multimodal resources (Koteyko &amp; Atanasova, 2018). Even so, the specific lexical and grammatical mechanisms through which short Instagram captions construct hope and empowerment remain underexamined in applied linguistics and discourse analysis.</w:t>
+      </w:r>
+      <w:r>
+        <w:rPr>
+          <w:rFonts w:ascii="Georgia" w:hAnsi="Georgia" w:cs="Georgia"/>
+          <w:sz w:val="22"/>
           <w:rtl w:val="0"/>
         </w:rPr>
       </w:r>
@@ -787,6 +786,7 @@
       <w:pPr>
         <w:spacing w:line="480" w:lineRule="auto"/>
         <w:ind w:firstLine="720"/>
+        <w:jc w:val="both"/>
       </w:pPr>
       <w:r>
         <w:rPr>
@@ -802,6 +802,7 @@
       <w:pPr>
         <w:spacing w:line="480" w:lineRule="auto"/>
         <w:ind w:firstLine="720"/>
+        <w:jc w:val="both"/>
       </w:pPr>
       <w:r>
         <w:rPr>
@@ -817,6 +818,7 @@
       <w:pPr>
         <w:spacing w:line="480" w:lineRule="auto"/>
         <w:ind w:firstLine="720"/>
+        <w:jc w:val="both"/>
       </w:pPr>
       <w:r>
         <w:rPr>

</xml_diff>

<commit_message>
Add Hope as Distinct Construct subsection (McCosker, Lindgren, Beelen) with full analysis
</commit_message>
<xml_diff>
--- a/thesis/Thesis_Proposal_Instagram_MH_v07.docx
+++ b/thesis/Thesis_Proposal_Instagram_MH_v07.docx
@@ -732,6 +732,80 @@
     </w:p>
     <w:p>
       <w:pPr>
+        <w:spacing w:line="480" w:lineRule="auto"/>
+        <w:jc w:val="left"/>
+      </w:pPr>
+      <w:r>
+        <w:rPr>
+          <w:rFonts w:ascii="Georgia" w:hAnsi="Georgia" w:cs="Georgia"/>
+          <w:sz w:val="24"/>
+          <w:szCs w:val="24"/>
+        </w:rPr>
+        <w:t>Hope as a Distinct Construct in Digital Mental Health Discourse</w:t>
+      </w:r>
+    </w:p>
+    <w:p>
+      <w:pPr>
+        <w:spacing w:line="480" w:lineRule="auto"/>
+        <w:ind w:firstLine="720"/>
+        <w:jc w:val="both"/>
+      </w:pPr>
+      <w:r>
+        <w:rPr>
+          <w:rFonts w:ascii="Georgia" w:hAnsi="Georgia" w:cs="Georgia"/>
+          <w:sz w:val="22"/>
+          <w:szCs w:val="22"/>
+        </w:rPr>
+        <w:t xml:space="preserve">Hope appears frequently in mental health content on Instagram, yet it is often treated as one instance of general positivity rather than as a distinct discursive construct. McCosker and Gerrard (2021) examined hashtag practices around #depressed on Instagram and developed a hashtag practice approach that moves beyond single-tag sampling. Their method incorporates adjacent posts, collocated hashtags, and the interplay of visual content, captions, and profile management. The analysis shows that only a minority of posts tagged with #depressed explicitly convey the embodied experience of depression. Many posts instead rely on aesthetic and memetic practices, careful modulation of visibility, and recovery-oriented framing. Users often code their posts in ways that negotiate identification with depression while still signalling struggle or recovery. This work establishes that hopeful and recovery-oriented forms of engagement are present on the platform, but they sit inside a wider and more heterogeneous set of practices than earlier research assumed.</w:t>
+      </w:r>
+    </w:p>
+    <w:p>
+      <w:pPr>
+        <w:spacing w:line="480" w:lineRule="auto"/>
+        <w:ind w:firstLine="720"/>
+        <w:jc w:val="both"/>
+      </w:pPr>
+      <w:r>
+        <w:rPr>
+          <w:rFonts w:ascii="Georgia" w:hAnsi="Georgia" w:cs="Georgia"/>
+          <w:sz w:val="22"/>
+          <w:szCs w:val="22"/>
+        </w:rPr>
+        <w:t>Lindgren and Johansson (2023) analyzed 600 Instagram posts that used mental health related hashtags and examined how support practices relate to the platform’s perceptible affordances. They found that 61 percent of the posts were recovery oriented. These posts typically presented casual snapshots of individual progress and aligned with broader discourses of positive thinking and individual responsibility. Motivational picture quotes formed a notable negotiated use. They appeared in about 10 percent of the coded images and functioned as standardized messages of hope and fighting spirit. Comments on such posts often shifted from person-centred praise toward a shared sense of struggle and encouragement. The study shows that Instagram privileges recovery-oriented visual narratives, yet users also adapt the platform’s features to circulate collective messages of hope. Hope in this material is not only a private feeling. It is publicly performed through recurring visual and textual forms that invite affiliation.</w:t>
+      </w:r>
+    </w:p>
+    <w:p>
+      <w:pPr>
+        <w:spacing w:line="480" w:lineRule="auto"/>
+        <w:ind w:firstLine="720"/>
+        <w:jc w:val="both"/>
+      </w:pPr>
+      <w:r>
+        <w:rPr>
+          <w:rFonts w:ascii="Georgia" w:hAnsi="Georgia" w:cs="Georgia"/>
+          <w:sz w:val="22"/>
+          <w:szCs w:val="22"/>
+        </w:rPr>
+        <w:t xml:space="preserve">Beelen and Karsay (2024) tested whether hopeful mental health posts on Instagram actually raise hope and related outcomes. They conducted a 2 by 2 between-subjects experiment with 479 young adults and manipulated message type (hope message versus control) and endorsement level (high versus low likes). Drawing on appraisal theory and spillover effects, they expected hope messages to increase subsequent hope and life satisfaction, reduce stigma, and raise willingness to disclose and to offer support. The pre-registered analysis found no significant main or interaction effects in the predicted direction. Exposure to hopeful Instagram posts did not reliably produce the anticipated gains. The finding is important for the present study. Hope content is common on the platform, and recovery-oriented forms are frequent, yet the linguistic and multimodal strategies that construct hope still require close analysis. Audience effects cannot be assumed from the presence of hopeful framing alone.</w:t>
+      </w:r>
+    </w:p>
+    <w:p>
+      <w:pPr>
+        <w:spacing w:line="480" w:lineRule="auto"/>
+        <w:ind w:firstLine="720"/>
+        <w:jc w:val="both"/>
+      </w:pPr>
+      <w:r>
+        <w:rPr>
+          <w:rFonts w:ascii="Georgia" w:hAnsi="Georgia" w:cs="Georgia"/>
+          <w:sz w:val="22"/>
+          <w:szCs w:val="22"/>
+        </w:rPr>
+        <w:t xml:space="preserve">Taken together, these studies move the discussion beyond general positivity. They show that hope and recovery language circulate widely on Instagram, that users actively shape how such messages appear, and that the effects of hopeful posts on audiences are not automatic. What remains under-examined is the specific lexical and grammatical work through which short advocacy captions construct hope and empowerment as discursive orientations. That gap motivates the present study’s focus on caption strategies and on the linguistic features of public comment responses.</w:t>
+      </w:r>
+    </w:p>
+    <w:p>
+      <w:pPr>
         <w:keepNext w:val="1"/>
         <w:spacing w:after="480" w:before="480" w:line="480" w:lineRule="auto"/>
         <w:jc w:val="left"/>
@@ -3235,6 +3309,51 @@
     <w:p>
       <w:r>
         <w:t>Kim, M., Saha, K., De Choudhury, M., &amp; Choi, D. (2023). Supporters first: Understanding online social support on mental health from a supporter perspective. Proceedings of the ACM on Human-Computer Interaction, 7(CSCW1), Article 92. https://doi.org/10.1145/3579525</w:t>
+      </w:r>
+    </w:p>
+    <w:p>
+      <w:pPr>
+        <w:spacing w:line="480" w:lineRule="auto"/>
+        <w:ind w:left="720" w:hanging="720"/>
+        <w:jc w:val="both"/>
+      </w:pPr>
+      <w:r>
+        <w:rPr>
+          <w:rFonts w:ascii="Georgia" w:hAnsi="Georgia" w:cs="Georgia"/>
+          <w:sz w:val="22"/>
+          <w:szCs w:val="22"/>
+        </w:rPr>
+        <w:t xml:space="preserve">McCosker, A., &amp; Gerrard, Y. (2021). Hashtagging depression on Instagram: Towards a more inclusive mental health research methodology. New Media &amp; Society, 23(7), 1899–1919. https://doi.org/10.1177/1461444820921349</w:t>
+      </w:r>
+    </w:p>
+    <w:p>
+      <w:pPr>
+        <w:spacing w:line="480" w:lineRule="auto"/>
+        <w:ind w:left="720" w:hanging="720"/>
+        <w:jc w:val="both"/>
+      </w:pPr>
+      <w:r>
+        <w:rPr>
+          <w:rFonts w:ascii="Georgia" w:hAnsi="Georgia" w:cs="Georgia"/>
+          <w:sz w:val="22"/>
+          <w:szCs w:val="22"/>
+        </w:rPr>
+        <w:t xml:space="preserve">Lindgren, S., &amp; Johansson, A. (2023). Getting better? Hegemonic, negotiated and oppositional uses of Instagram for mental health support. Journal of Communication Inquiry, 47(3), 268–290. https://doi.org/10.1177/01968599211042581</w:t>
+      </w:r>
+    </w:p>
+    <w:p>
+      <w:pPr>
+        <w:spacing w:line="480" w:lineRule="auto"/>
+        <w:ind w:left="720" w:hanging="720"/>
+        <w:jc w:val="both"/>
+      </w:pPr>
+      <w:r>
+        <w:rPr>
+          <w:rFonts w:ascii="Georgia" w:hAnsi="Georgia" w:cs="Georgia"/>
+          <w:sz w:val="22"/>
+          <w:szCs w:val="22"/>
+        </w:rPr>
+        <w:t xml:space="preserve">Beelen, E., &amp; Karsay, K. (2024). “The future is bright! Is it?”: Investigating effects of hopeful mental health content and endorsement cues on social media. Social Media + Society, 10(3), 1–18. https://doi.org/10.1177/20563051241277603</w:t>
       </w:r>
     </w:p>
     <w:p>

</xml_diff>

<commit_message>
Expand Research Gap and Rationale: synthesize literature, state three linked gaps, position the study
</commit_message>
<xml_diff>
--- a/thesis/Thesis_Proposal_Instagram_MH_v07.docx
+++ b/thesis/Thesis_Proposal_Instagram_MH_v07.docx
@@ -961,32 +961,14 @@
         <w:spacing w:line="480" w:lineRule="auto"/>
         <w:ind w:firstLine="720"/>
         <w:jc w:val="both"/>
-        <w:rPr/>
-      </w:pPr>
-      <w:r>
-        <w:rPr>
-          <w:rFonts w:ascii="Georgia" w:cs="Georgia" w:eastAsia="Georgia" w:hAnsi="Georgia"/>
-          <w:sz w:val="22"/>
-          <w:szCs w:val="22"/>
-          <w:rtl w:val="0"/>
-        </w:rPr>
-        <w:t>Despite the growing volume of mental health content on Instagram, few studies apply a discourse-analytic lens to categorize the specific lexical and grammatical strategies used in captions, and fewer still examine how comment language structurally aligns with those strategies. While Koteyko and Atanasova (2018) demonstrate the value of discourse-analytic approaches for analyzing mental health advocacy on social media, their focus on Twitter positioning and multimodal interaction differs from this study's specific focus on hope and empowerment construction within Instagram captions.</w:t>
-      </w:r>
-      <w:r>
-        <w:rPr>
-          <w:rtl w:val="0"/>
-        </w:rPr>
-      </w:r>
-    </w:p>
-    <w:p>
-      <w:pPr>
-        <w:spacing w:line="480" w:lineRule="auto"/>
-        <w:rPr/>
-      </w:pPr>
-      <w:r>
-        <w:rPr>
-          <w:rtl w:val="0"/>
-        </w:rPr>
+      </w:pPr>
+      <w:r>
+        <w:rPr>
+          <w:rFonts w:ascii="Georgia" w:hAnsi="Georgia" w:cs="Georgia"/>
+          <w:sz w:val="22"/>
+          <w:szCs w:val="22"/>
+        </w:rPr>
+        <w:t>The literature reviewed above establishes several clear findings. Mental health content on Instagram is predominantly positive in tone and draws high engagement when it uses motivational framing and recovery-oriented visuals (Wu &amp; Hong, 2022; Koinig, 2022; Lindgren &amp; Johansson, 2023). Hope appears as a recurring theme in recovery-oriented posts and in experimental tests of hopeful messages, yet exposure alone does not reliably increase hope or reduce stigma (Beelen &amp; Karsay, 2024; McCosker &amp; Gerrard, 2021). Audience comments in digital support spaces follow recognizable patterns of informational and emotional support, personal narrative, and, less often, network-oriented replies (Chang, 2009; Kim et al., 2023; Myrick et al., 2015; Wang, 2025). Positive Discourse Analysis supplies a theoretical frame for studying how language constructs optimism and agency rather than only documenting deficit (Martin, 2004; Macgilchrist, 2007).</w:t>
       </w:r>
     </w:p>
     <w:p>
@@ -994,21 +976,44 @@
         <w:spacing w:line="480" w:lineRule="auto"/>
         <w:ind w:firstLine="720"/>
         <w:jc w:val="both"/>
-        <w:rPr/>
-      </w:pPr>
-      <w:r>
-        <w:rPr>
-          <w:rFonts w:ascii="Georgia" w:cs="Georgia" w:eastAsia="Georgia" w:hAnsi="Georgia"/>
-          <w:sz w:val="22"/>
-          <w:szCs w:val="22"/>
-          <w:rtl w:val="0"/>
-        </w:rPr>
-        <w:t xml:space="preserve">The 2023–2025 data window captures the post-pandemic normalization of mental health communication on social media. Years are pooled for corpus diversity; no cross-year trend comparison is performed. This design maintains analytical depth while remaining feasible for undergraduate qualitative research.</w:t>
-      </w:r>
-      <w:r>
-        <w:rPr>
-          <w:rtl w:val="0"/>
-        </w:rPr>
+      </w:pPr>
+      <w:r>
+        <w:rPr>
+          <w:rFonts w:ascii="Georgia" w:hAnsi="Georgia" w:cs="Georgia"/>
+          <w:sz w:val="22"/>
+          <w:szCs w:val="22"/>
+        </w:rPr>
+        <w:t>Despite these advances, three linked gaps remain. First, few studies apply a discourse-analytic lens to the specific lexical and grammatical strategies through which short Instagram advocacy captions construct hope and empowerment as discursive orientations. Existing work tends to code content for sentiment, theme, or recovery orientation. It does not systematically track modality, directive structures, person reference, or other grammatical resources that build future-oriented possibility and agentive stance. Second, comment language is still rarely examined as structured response to those caption strategies. Most analyses treat comments as engagement metrics or broad support types rather than as linguistic alignments with the hope and empowerment work of the original post. Third, platform-specific discourse analysis of mental health advocacy on Instagram remains thinner than parallel work on Twitter and peer-support forums, even though Instagram is a primary site for visual and caption-based advocacy among young audiences.</w:t>
+      </w:r>
+    </w:p>
+    <w:p>
+      <w:pPr>
+        <w:spacing w:line="480" w:lineRule="auto"/>
+        <w:ind w:firstLine="720"/>
+        <w:jc w:val="both"/>
+      </w:pPr>
+      <w:r>
+        <w:rPr>
+          <w:rFonts w:ascii="Georgia" w:hAnsi="Georgia" w:cs="Georgia"/>
+          <w:sz w:val="22"/>
+          <w:szCs w:val="22"/>
+        </w:rPr>
+        <w:t>Koteyko and Atanasova (2018) demonstrate the value of discourse-analytic approaches for mental health advocacy on social media. Their focus on Twitter positioning and multimodal interaction, however, differs from this study’s concern with hope and empowerment construction inside Instagram captions and with the linguistic features of public comment responses. Naslund et al. (2016) document the growth of peer support on social media but do not analyze the grammar of advocacy captions. The present study addresses the gap by pairing Positive Discourse Analysis with an adapted support typology. It examines both caption strategies and comment patterns within a single 2023–2025 corpus of public Instagram mental health advocacy posts.</w:t>
+      </w:r>
+    </w:p>
+    <w:p>
+      <w:pPr>
+        <w:spacing w:line="480" w:lineRule="auto"/>
+        <w:ind w:firstLine="720"/>
+        <w:jc w:val="both"/>
+      </w:pPr>
+      <w:r>
+        <w:rPr>
+          <w:rFonts w:ascii="Georgia" w:hAnsi="Georgia" w:cs="Georgia"/>
+          <w:sz w:val="22"/>
+          <w:szCs w:val="22"/>
+        </w:rPr>
+        <w:t>The 2023–2025 data window captures the post-pandemic normalization of mental health communication on social media. Years are pooled for corpus diversity. No cross-year trend comparison is performed. This design keeps analytical depth feasible for undergraduate qualitative research while situating the corpus in a period when mental health talk on Instagram had become both more visible and more conventionalized.</w:t>
       </w:r>
     </w:p>
     <w:p>

</xml_diff>

<commit_message>
Fold Instagram caption platform affordance (125-char preview) into Positivity section
</commit_message>
<xml_diff>
--- a/thesis/Thesis_Proposal_Instagram_MH_v07.docx
+++ b/thesis/Thesis_Proposal_Instagram_MH_v07.docx
@@ -728,6 +728,21 @@
         <w:rPr>
           <w:rtl w:val="0"/>
         </w:rPr>
+      </w:r>
+    </w:p>
+    <w:p>
+      <w:pPr>
+        <w:spacing w:line="480" w:lineRule="auto"/>
+        <w:ind w:firstLine="720"/>
+        <w:jc w:val="both"/>
+      </w:pPr>
+      <w:r>
+        <w:rPr>
+          <w:rFonts w:ascii="Georgia" w:hAnsi="Georgia" w:cs="Georgia"/>
+          <w:sz w:val="22"/>
+          <w:szCs w:val="22"/>
+        </w:rPr>
+        <w:t xml:space="preserve">Instagram’s interface itself shapes how captions are written. Only the first roughly 125 characters, or about three lines, appear in the feed before the reader must tap “more” (Lindgren &amp; Johansson, 2023). Writers therefore tend to place a strong opening line, develop value or emotion in the body, and close with a call to action or reflective prompt. This conventional shape is a platform affordance rather than a formal rule. The present study does not test marketing formulas. It examines the lexical and grammatical resources through which hope and empowerment are constructed inside that constrained caption space.</w:t>
       </w:r>
     </w:p>
     <w:p>

</xml_diff>

<commit_message>
Add empowerment literature paragraph to balance hope coverage in BOTS
</commit_message>
<xml_diff>
--- a/thesis/Thesis_Proposal_Instagram_MH_v07.docx
+++ b/thesis/Thesis_Proposal_Instagram_MH_v07.docx
@@ -817,6 +817,21 @@
           <w:szCs w:val="22"/>
         </w:rPr>
         <w:t xml:space="preserve">Taken together, these studies move the discussion beyond general positivity. They show that hope and recovery language circulate widely on Instagram, that users actively shape how such messages appear, and that the effects of hopeful posts on audiences are not automatic. What remains under-examined is the specific lexical and grammatical work through which short advocacy captions construct hope and empowerment as discursive orientations. That gap motivates the present study’s focus on caption strategies and on the linguistic features of public comment responses.</w:t>
+      </w:r>
+    </w:p>
+    <w:p>
+      <w:pPr>
+        <w:spacing w:line="480" w:lineRule="auto"/>
+        <w:ind w:firstLine="720"/>
+        <w:jc w:val="both"/>
+      </w:pPr>
+      <w:r>
+        <w:rPr>
+          <w:rFonts w:ascii="Georgia" w:hAnsi="Georgia" w:cs="Georgia"/>
+          <w:sz w:val="22"/>
+          <w:szCs w:val="22"/>
+        </w:rPr>
+        <w:t xml:space="preserve">Empowerment is the second discursive orientation named in this study, yet it has received less direct attention in Instagram mental health research than hope. In health and advocacy discourse, empowerment is typically linked to agency, voice, and the capacity to act on one’s own behalf. Positive Discourse Analysis treats such agency as a central concern. It asks how language positions readers as capable actors rather than as passive recipients of care (Martin, 2004; Macgilchrist, 2007). On social media, empowerment often appears through second-person address, directive structures, and invitations to share, seek help, or reframe experience. These features are visible in recovery-oriented and advocacy captions, but few studies isolate empowerment as a lexical and grammatical construct in the same way that recent work has begun to isolate hope. The present study therefore examines hope construction and empowerment language as paired orientations within the same caption corpus.</w:t>
       </w:r>
     </w:p>
     <w:p>

</xml_diff>